<commit_message>
fix(comercial): alinhar proposta aos modelos
</commit_message>
<xml_diff>
--- a/Modelos/definitivos/Comercial/modelos/Proposta técnica hidrojateamento.docx
+++ b/Modelos/definitivos/Comercial/modelos/Proposta técnica hidrojateamento.docx
@@ -5704,1429 +5704,6 @@
         </w:rPr>
         <w:t>- Escopo Técnico:</w:t>
       </w:r>
-    </w:p>
-    <w:p>
-      <w:pPr>
-        <w:autoSpaceDE w:val="0"/>
-        <w:autoSpaceDN w:val="0"/>
-        <w:adjustRightInd w:val="0"/>
-        <w:spacing w:after="0" w:line="240" w:lineRule="auto"/>
-        <w:jc w:val="both"/>
-        <w:rPr>
-          <w:rFonts w:ascii="Arial" w:hAnsi="Arial" w:cs="Arial"/>
-          <w:sz w:val="20"/>
-          <w:szCs w:val="20"/>
-        </w:rPr>
-      </w:pPr>
-    </w:p>
-    <w:p>
-      <w:pPr>
-        <w:autoSpaceDE w:val="0"/>
-        <w:autoSpaceDN w:val="0"/>
-        <w:adjustRightInd w:val="0"/>
-        <w:spacing w:after="0" w:line="240" w:lineRule="auto"/>
-        <w:jc w:val="both"/>
-        <w:rPr>
-          <w:rFonts w:ascii="Arial" w:hAnsi="Arial" w:cs="Arial"/>
-          <w:sz w:val="20"/>
-          <w:szCs w:val="20"/>
-        </w:rPr>
-      </w:pPr>
-    </w:p>
-    <w:p>
-      <w:pPr>
-        <w:pStyle w:val="PargrafodaLista"/>
-        <w:numPr>
-          <w:ilvl w:val="1"/>
-          <w:numId w:val="2"/>
-        </w:numPr>
-        <w:spacing w:after="0" w:line="240" w:lineRule="auto"/>
-        <w:jc w:val="both"/>
-        <w:rPr>
-          <w:rFonts w:ascii="Arial" w:hAnsi="Arial" w:cs="Arial"/>
-          <w:b/>
-          <w:sz w:val="20"/>
-          <w:szCs w:val="20"/>
-        </w:rPr>
-      </w:pPr>
-      <w:r>
-        <w:rPr>
-          <w:rFonts w:ascii="Arial" w:hAnsi="Arial" w:cs="Arial"/>
-          <w:b/>
-          <w:sz w:val="20"/>
-          <w:szCs w:val="20"/>
-        </w:rPr>
-        <w:t>-</w:t>
-      </w:r>
-      <w:r>
-        <w:rPr>
-          <w:rFonts w:ascii="Arial" w:hAnsi="Arial" w:cs="Arial"/>
-          <w:b/>
-          <w:sz w:val="20"/>
-          <w:szCs w:val="20"/>
-        </w:rPr>
-        <w:t xml:space="preserve"> Hidrojateamento</w:t>
-      </w:r>
-      <w:r>
-        <w:rPr>
-          <w:rFonts w:ascii="Arial" w:hAnsi="Arial" w:cs="Arial"/>
-          <w:b/>
-          <w:bCs/>
-          <w:sz w:val="20"/>
-          <w:szCs w:val="20"/>
-        </w:rPr>
-        <w:t xml:space="preserve"> </w:t>
-      </w:r>
-    </w:p>
-    <w:p>
-      <w:pPr>
-        <w:spacing w:after="0" w:line="240" w:lineRule="auto"/>
-        <w:ind w:firstLine="708"/>
-        <w:jc w:val="both"/>
-        <w:rPr>
-          <w:rFonts w:ascii="Arial" w:hAnsi="Arial" w:cs="Arial"/>
-          <w:b/>
-          <w:sz w:val="20"/>
-          <w:szCs w:val="20"/>
-        </w:rPr>
-      </w:pPr>
-    </w:p>
-    <w:p>
-      <w:pPr>
-        <w:spacing w:after="0" w:line="240" w:lineRule="auto"/>
-        <w:ind w:firstLine="708"/>
-        <w:jc w:val="both"/>
-        <w:rPr>
-          <w:rFonts w:ascii="Arial" w:hAnsi="Arial" w:cs="Arial"/>
-          <w:bCs/>
-          <w:sz w:val="20"/>
-          <w:szCs w:val="20"/>
-        </w:rPr>
-      </w:pPr>
-      <w:r>
-        <w:rPr>
-          <w:rFonts w:ascii="Arial" w:hAnsi="Arial" w:cs="Arial"/>
-          <w:bCs/>
-          <w:sz w:val="20"/>
-          <w:szCs w:val="20"/>
-        </w:rPr>
-        <w:t>O serviço de hidrojateamento consiste na aplicação de jato de água em ultra alta pressão para remoção de incrustações, resíduos aderidos, depósitos sólidos, contaminantes e obstruções em superfícies</w:t>
-      </w:r>
-      <w:r>
-        <w:rPr>
-          <w:rFonts w:ascii="Arial" w:hAnsi="Arial" w:cs="Arial"/>
-          <w:bCs/>
-          <w:sz w:val="20"/>
-          <w:szCs w:val="20"/>
-        </w:rPr>
-        <w:t xml:space="preserve">, </w:t>
-      </w:r>
-      <w:r>
-        <w:rPr>
-          <w:rFonts w:ascii="Arial" w:hAnsi="Arial" w:cs="Arial"/>
-          <w:bCs/>
-          <w:sz w:val="20"/>
-          <w:szCs w:val="20"/>
-        </w:rPr>
-        <w:t>equipamentos industriais</w:t>
-      </w:r>
-      <w:r>
-        <w:rPr>
-          <w:rFonts w:ascii="Arial" w:hAnsi="Arial" w:cs="Arial"/>
-          <w:bCs/>
-          <w:sz w:val="20"/>
-          <w:szCs w:val="20"/>
-        </w:rPr>
-        <w:t xml:space="preserve"> e tubulações, </w:t>
-      </w:r>
-      <w:r>
-        <w:rPr>
-          <w:rFonts w:ascii="Arial" w:hAnsi="Arial" w:cs="Arial"/>
-          <w:bCs/>
-          <w:sz w:val="20"/>
-          <w:szCs w:val="20"/>
-        </w:rPr>
-        <w:t>sem utilização de abrasivos ou agentes químicos agressivos, preservando a integridade estrutural do material base.</w:t>
-      </w:r>
-    </w:p>
-    <w:p>
-      <w:pPr>
-        <w:spacing w:after="0" w:line="240" w:lineRule="auto"/>
-        <w:ind w:firstLine="708"/>
-        <w:jc w:val="both"/>
-        <w:rPr>
-          <w:rFonts w:ascii="Arial" w:hAnsi="Arial" w:cs="Arial"/>
-          <w:bCs/>
-          <w:sz w:val="20"/>
-          <w:szCs w:val="20"/>
-        </w:rPr>
-      </w:pPr>
-    </w:p>
-    <w:p>
-      <w:pPr>
-        <w:pStyle w:val="PargrafodaLista"/>
-        <w:numPr>
-          <w:ilvl w:val="2"/>
-          <w:numId w:val="2"/>
-        </w:numPr>
-        <w:spacing w:after="0" w:line="240" w:lineRule="auto"/>
-        <w:jc w:val="both"/>
-        <w:rPr>
-          <w:rFonts w:ascii="Arial" w:hAnsi="Arial" w:cs="Arial"/>
-          <w:b/>
-          <w:sz w:val="20"/>
-          <w:szCs w:val="20"/>
-        </w:rPr>
-      </w:pPr>
-      <w:r>
-        <w:rPr>
-          <w:rFonts w:ascii="Arial" w:hAnsi="Arial" w:cs="Arial"/>
-          <w:b/>
-          <w:sz w:val="20"/>
-          <w:szCs w:val="20"/>
-        </w:rPr>
-        <w:t>Objetivo</w:t>
-      </w:r>
-      <w:r>
-        <w:rPr>
-          <w:rFonts w:ascii="Arial" w:hAnsi="Arial" w:cs="Arial"/>
-          <w:b/>
-          <w:sz w:val="20"/>
-          <w:szCs w:val="20"/>
-        </w:rPr>
-        <w:t>s Gerais</w:t>
-      </w:r>
-    </w:p>
-    <w:p>
-      <w:pPr>
-        <w:pStyle w:val="PargrafodaLista"/>
-        <w:spacing w:after="0" w:line="240" w:lineRule="auto"/>
-        <w:ind w:left="2136"/>
-        <w:jc w:val="both"/>
-        <w:rPr>
-          <w:rFonts w:ascii="Arial" w:hAnsi="Arial" w:cs="Arial"/>
-          <w:b/>
-          <w:sz w:val="20"/>
-          <w:szCs w:val="20"/>
-        </w:rPr>
-      </w:pPr>
-    </w:p>
-    <w:p>
-      <w:pPr>
-        <w:pStyle w:val="PargrafodaLista"/>
-        <w:numPr>
-          <w:ilvl w:val="3"/>
-          <w:numId w:val="2"/>
-        </w:numPr>
-        <w:spacing w:after="0" w:line="360" w:lineRule="auto"/>
-        <w:jc w:val="both"/>
-        <w:rPr>
-          <w:rFonts w:ascii="Arial" w:hAnsi="Arial" w:cs="Arial"/>
-          <w:b/>
-          <w:sz w:val="20"/>
-          <w:szCs w:val="20"/>
-        </w:rPr>
-      </w:pPr>
-      <w:r>
-        <w:rPr>
-          <w:rFonts w:ascii="Arial" w:hAnsi="Arial" w:cs="Arial"/>
-          <w:sz w:val="20"/>
-          <w:szCs w:val="20"/>
-        </w:rPr>
-        <w:t>Remover incrustações minerais, lama, depósitos sólidos e resíduos aderidos no interior de tubulações</w:t>
-      </w:r>
-      <w:r>
-        <w:rPr>
-          <w:rFonts w:ascii="Arial" w:hAnsi="Arial" w:cs="Arial"/>
-          <w:sz w:val="20"/>
-          <w:szCs w:val="20"/>
-        </w:rPr>
-        <w:t>;</w:t>
-      </w:r>
-    </w:p>
-    <w:p>
-      <w:pPr>
-        <w:pStyle w:val="PargrafodaLista"/>
-        <w:numPr>
-          <w:ilvl w:val="3"/>
-          <w:numId w:val="2"/>
-        </w:numPr>
-        <w:spacing w:after="0" w:line="360" w:lineRule="auto"/>
-        <w:jc w:val="both"/>
-        <w:rPr>
-          <w:rFonts w:ascii="Arial" w:hAnsi="Arial" w:cs="Arial"/>
-          <w:b/>
-          <w:sz w:val="20"/>
-          <w:szCs w:val="20"/>
-        </w:rPr>
-      </w:pPr>
-      <w:r>
-        <w:rPr>
-          <w:rFonts w:ascii="Arial" w:hAnsi="Arial" w:cs="Arial"/>
-          <w:sz w:val="20"/>
-          <w:szCs w:val="20"/>
-        </w:rPr>
-        <w:t>Desobstruir parcial ou totalmente linhas industriai</w:t>
-      </w:r>
-      <w:r>
-        <w:rPr>
-          <w:rFonts w:ascii="Arial" w:hAnsi="Arial" w:cs="Arial"/>
-          <w:sz w:val="20"/>
-          <w:szCs w:val="20"/>
-        </w:rPr>
-        <w:t>s;</w:t>
-      </w:r>
-    </w:p>
-    <w:p>
-      <w:pPr>
-        <w:pStyle w:val="PargrafodaLista"/>
-        <w:numPr>
-          <w:ilvl w:val="3"/>
-          <w:numId w:val="2"/>
-        </w:numPr>
-        <w:spacing w:after="0" w:line="360" w:lineRule="auto"/>
-        <w:jc w:val="both"/>
-        <w:rPr>
-          <w:rFonts w:ascii="Arial" w:hAnsi="Arial" w:cs="Arial"/>
-          <w:b/>
-          <w:sz w:val="20"/>
-          <w:szCs w:val="20"/>
-        </w:rPr>
-      </w:pPr>
-      <w:r>
-        <w:rPr>
-          <w:rFonts w:ascii="Arial" w:hAnsi="Arial" w:cs="Arial"/>
-          <w:sz w:val="20"/>
-          <w:szCs w:val="20"/>
-        </w:rPr>
-        <w:t>Restaurar vazão nominal do sistema</w:t>
-      </w:r>
-      <w:r>
-        <w:rPr>
-          <w:rFonts w:ascii="Arial" w:hAnsi="Arial" w:cs="Arial"/>
-          <w:sz w:val="20"/>
-          <w:szCs w:val="20"/>
-        </w:rPr>
-        <w:t>;</w:t>
-      </w:r>
-    </w:p>
-    <w:p>
-      <w:pPr>
-        <w:pStyle w:val="PargrafodaLista"/>
-        <w:numPr>
-          <w:ilvl w:val="3"/>
-          <w:numId w:val="2"/>
-        </w:numPr>
-        <w:spacing w:after="0" w:line="360" w:lineRule="auto"/>
-        <w:jc w:val="both"/>
-        <w:rPr>
-          <w:rFonts w:ascii="Arial" w:hAnsi="Arial" w:cs="Arial"/>
-          <w:b/>
-          <w:sz w:val="20"/>
-          <w:szCs w:val="20"/>
-        </w:rPr>
-      </w:pPr>
-      <w:r>
-        <w:rPr>
-          <w:rFonts w:ascii="Arial" w:hAnsi="Arial" w:cs="Arial"/>
-          <w:sz w:val="20"/>
-          <w:szCs w:val="20"/>
-        </w:rPr>
-        <w:t>Melhorar eficiência operacional e troca térmica, quando aplicável</w:t>
-      </w:r>
-      <w:r>
-        <w:rPr>
-          <w:rFonts w:ascii="Arial" w:hAnsi="Arial" w:cs="Arial"/>
-          <w:sz w:val="20"/>
-          <w:szCs w:val="20"/>
-        </w:rPr>
-        <w:t>;</w:t>
-      </w:r>
-    </w:p>
-    <w:p>
-      <w:pPr>
-        <w:pStyle w:val="PargrafodaLista"/>
-        <w:numPr>
-          <w:ilvl w:val="3"/>
-          <w:numId w:val="2"/>
-        </w:numPr>
-        <w:spacing w:after="0" w:line="360" w:lineRule="auto"/>
-        <w:jc w:val="both"/>
-        <w:rPr>
-          <w:rFonts w:ascii="Arial" w:hAnsi="Arial" w:cs="Arial"/>
-          <w:b/>
-          <w:sz w:val="20"/>
-          <w:szCs w:val="20"/>
-        </w:rPr>
-      </w:pPr>
-      <w:r>
-        <w:rPr>
-          <w:rFonts w:ascii="Arial" w:hAnsi="Arial" w:cs="Arial"/>
-          <w:sz w:val="20"/>
-          <w:szCs w:val="20"/>
-        </w:rPr>
-        <w:t>Preparar superfície para inspeção, teste hidrostático ou outro processo subsequente</w:t>
-      </w:r>
-      <w:r>
-        <w:rPr>
-          <w:rFonts w:ascii="Arial" w:hAnsi="Arial" w:cs="Arial"/>
-          <w:sz w:val="20"/>
-          <w:szCs w:val="20"/>
-        </w:rPr>
-        <w:t>;</w:t>
-      </w:r>
-    </w:p>
-    <w:p>
-      <w:pPr>
-        <w:pStyle w:val="PargrafodaLista"/>
-        <w:numPr>
-          <w:ilvl w:val="3"/>
-          <w:numId w:val="2"/>
-        </w:numPr>
-        <w:spacing w:after="0" w:line="240" w:lineRule="auto"/>
-        <w:jc w:val="both"/>
-        <w:rPr>
-          <w:rFonts w:ascii="Arial" w:hAnsi="Arial" w:cs="Arial"/>
-          <w:b/>
-          <w:sz w:val="20"/>
-          <w:szCs w:val="20"/>
-        </w:rPr>
-      </w:pPr>
-      <w:r>
-        <w:rPr>
-          <w:rFonts w:ascii="Arial" w:hAnsi="Arial" w:cs="Arial"/>
-          <w:sz w:val="20"/>
-          <w:szCs w:val="20"/>
-        </w:rPr>
-        <w:t>Reduzir riscos de sobrepressão e falhas operacionais</w:t>
-      </w:r>
-      <w:r>
-        <w:rPr>
-          <w:rFonts w:ascii="Arial" w:hAnsi="Arial" w:cs="Arial"/>
-          <w:sz w:val="20"/>
-          <w:szCs w:val="20"/>
-        </w:rPr>
-        <w:t>.</w:t>
-      </w:r>
-    </w:p>
-    <w:p>
-      <w:pPr>
-        <w:pStyle w:val="PargrafodaLista"/>
-        <w:spacing w:after="0" w:line="240" w:lineRule="auto"/>
-        <w:ind w:left="2136"/>
-        <w:jc w:val="both"/>
-        <w:rPr>
-          <w:rFonts w:ascii="Arial" w:hAnsi="Arial" w:cs="Arial"/>
-          <w:b/>
-          <w:sz w:val="20"/>
-          <w:szCs w:val="20"/>
-        </w:rPr>
-      </w:pPr>
-    </w:p>
-    <w:p>
-      <w:pPr>
-        <w:pStyle w:val="PargrafodaLista"/>
-        <w:numPr>
-          <w:ilvl w:val="2"/>
-          <w:numId w:val="2"/>
-        </w:numPr>
-        <w:spacing w:after="0" w:line="240" w:lineRule="auto"/>
-        <w:jc w:val="both"/>
-        <w:rPr>
-          <w:rFonts w:ascii="Arial" w:hAnsi="Arial" w:cs="Arial"/>
-          <w:b/>
-          <w:sz w:val="20"/>
-          <w:szCs w:val="20"/>
-        </w:rPr>
-      </w:pPr>
-      <w:r>
-        <w:rPr>
-          <w:rFonts w:ascii="Arial" w:hAnsi="Arial" w:cs="Arial"/>
-          <w:b/>
-          <w:bCs/>
-          <w:sz w:val="20"/>
-          <w:szCs w:val="20"/>
-        </w:rPr>
-        <w:t>Metodologia Aplicad</w:t>
-      </w:r>
-      <w:r>
-        <w:rPr>
-          <w:rFonts w:ascii="Arial" w:hAnsi="Arial" w:cs="Arial"/>
-          <w:b/>
-          <w:bCs/>
-          <w:sz w:val="20"/>
-          <w:szCs w:val="20"/>
-        </w:rPr>
-        <w:t>a</w:t>
-      </w:r>
-    </w:p>
-    <w:p>
-      <w:pPr>
-        <w:pStyle w:val="PargrafodaLista"/>
-        <w:spacing w:after="0" w:line="240" w:lineRule="auto"/>
-        <w:ind w:left="2136"/>
-        <w:jc w:val="both"/>
-        <w:rPr>
-          <w:rFonts w:ascii="Arial" w:hAnsi="Arial" w:cs="Arial"/>
-          <w:b/>
-          <w:bCs/>
-          <w:sz w:val="20"/>
-          <w:szCs w:val="20"/>
-        </w:rPr>
-      </w:pPr>
-    </w:p>
-    <w:p>
-      <w:pPr>
-        <w:pStyle w:val="PargrafodaLista"/>
-        <w:numPr>
-          <w:ilvl w:val="3"/>
-          <w:numId w:val="2"/>
-        </w:numPr>
-        <w:spacing w:after="0" w:line="360" w:lineRule="auto"/>
-        <w:jc w:val="both"/>
-        <w:rPr>
-          <w:rFonts w:ascii="Arial" w:hAnsi="Arial" w:cs="Arial"/>
-          <w:b/>
-          <w:sz w:val="20"/>
-          <w:szCs w:val="20"/>
-        </w:rPr>
-      </w:pPr>
-      <w:r>
-        <w:rPr>
-          <w:rFonts w:ascii="Arial" w:hAnsi="Arial" w:cs="Arial"/>
-          <w:sz w:val="20"/>
-          <w:szCs w:val="20"/>
-        </w:rPr>
-        <w:t>Avaliação preliminar do diâmetro, comprimento, material e grau de obstrução da tubulação</w:t>
-      </w:r>
-      <w:r>
-        <w:rPr>
-          <w:rFonts w:ascii="Arial" w:hAnsi="Arial" w:cs="Arial"/>
-          <w:sz w:val="20"/>
-          <w:szCs w:val="20"/>
-        </w:rPr>
-        <w:t>;</w:t>
-      </w:r>
-    </w:p>
-    <w:p>
-      <w:pPr>
-        <w:pStyle w:val="PargrafodaLista"/>
-        <w:numPr>
-          <w:ilvl w:val="3"/>
-          <w:numId w:val="2"/>
-        </w:numPr>
-        <w:spacing w:after="0" w:line="360" w:lineRule="auto"/>
-        <w:jc w:val="both"/>
-        <w:rPr>
-          <w:rFonts w:ascii="Arial" w:hAnsi="Arial" w:cs="Arial"/>
-          <w:b/>
-          <w:sz w:val="20"/>
-          <w:szCs w:val="20"/>
-        </w:rPr>
-      </w:pPr>
-      <w:r>
-        <w:rPr>
-          <w:rFonts w:ascii="Arial" w:hAnsi="Arial" w:cs="Arial"/>
-          <w:sz w:val="20"/>
-          <w:szCs w:val="20"/>
-        </w:rPr>
-        <w:t>Definição da pressão de trabalho, vazão e tipo de bico rotativo ou direcionado</w:t>
-      </w:r>
-      <w:r>
-        <w:rPr>
-          <w:rFonts w:ascii="Arial" w:hAnsi="Arial" w:cs="Arial"/>
-          <w:sz w:val="20"/>
-          <w:szCs w:val="20"/>
-        </w:rPr>
-        <w:t>;</w:t>
-      </w:r>
-    </w:p>
-    <w:p>
-      <w:pPr>
-        <w:pStyle w:val="PargrafodaLista"/>
-        <w:numPr>
-          <w:ilvl w:val="3"/>
-          <w:numId w:val="2"/>
-        </w:numPr>
-        <w:spacing w:after="0" w:line="360" w:lineRule="auto"/>
-        <w:jc w:val="both"/>
-        <w:rPr>
-          <w:rFonts w:ascii="Arial" w:hAnsi="Arial" w:cs="Arial"/>
-          <w:b/>
-          <w:sz w:val="20"/>
-          <w:szCs w:val="20"/>
-        </w:rPr>
-      </w:pPr>
-      <w:r>
-        <w:rPr>
-          <w:rFonts w:ascii="Arial" w:hAnsi="Arial" w:cs="Arial"/>
-          <w:sz w:val="20"/>
-          <w:szCs w:val="20"/>
-        </w:rPr>
-        <w:t>Isolamento da linha e adequação das condições de segurança</w:t>
-      </w:r>
-      <w:r>
-        <w:rPr>
-          <w:rFonts w:ascii="Arial" w:hAnsi="Arial" w:cs="Arial"/>
-          <w:sz w:val="20"/>
-          <w:szCs w:val="20"/>
-        </w:rPr>
-        <w:t>;</w:t>
-      </w:r>
-    </w:p>
-    <w:p>
-      <w:pPr>
-        <w:pStyle w:val="PargrafodaLista"/>
-        <w:numPr>
-          <w:ilvl w:val="3"/>
-          <w:numId w:val="2"/>
-        </w:numPr>
-        <w:spacing w:after="0" w:line="360" w:lineRule="auto"/>
-        <w:jc w:val="both"/>
-        <w:rPr>
-          <w:rFonts w:ascii="Arial" w:hAnsi="Arial" w:cs="Arial"/>
-          <w:b/>
-          <w:sz w:val="20"/>
-          <w:szCs w:val="20"/>
-        </w:rPr>
-      </w:pPr>
-      <w:r>
-        <w:rPr>
-          <w:rFonts w:ascii="Arial" w:hAnsi="Arial" w:cs="Arial"/>
-          <w:sz w:val="20"/>
-          <w:szCs w:val="20"/>
-        </w:rPr>
-        <w:t>Introdução do conjunto mangueira/bico específico para limpeza interna</w:t>
-      </w:r>
-      <w:r>
-        <w:rPr>
-          <w:rFonts w:ascii="Arial" w:hAnsi="Arial" w:cs="Arial"/>
-          <w:sz w:val="20"/>
-          <w:szCs w:val="20"/>
-        </w:rPr>
-        <w:t>;</w:t>
-      </w:r>
-    </w:p>
-    <w:p>
-      <w:pPr>
-        <w:pStyle w:val="PargrafodaLista"/>
-        <w:numPr>
-          <w:ilvl w:val="3"/>
-          <w:numId w:val="2"/>
-        </w:numPr>
-        <w:spacing w:after="0" w:line="360" w:lineRule="auto"/>
-        <w:jc w:val="both"/>
-        <w:rPr>
-          <w:rFonts w:ascii="Arial" w:hAnsi="Arial" w:cs="Arial"/>
-          <w:b/>
-          <w:sz w:val="20"/>
-          <w:szCs w:val="20"/>
-        </w:rPr>
-      </w:pPr>
-      <w:r>
-        <w:rPr>
-          <w:rFonts w:ascii="Arial" w:hAnsi="Arial" w:cs="Arial"/>
-          <w:sz w:val="20"/>
-          <w:szCs w:val="20"/>
-        </w:rPr>
-        <w:t>Aplicação do jato de água em ultra alta pressão com avanço controlado</w:t>
-      </w:r>
-      <w:r>
-        <w:rPr>
-          <w:rFonts w:ascii="Arial" w:hAnsi="Arial" w:cs="Arial"/>
-          <w:sz w:val="20"/>
-          <w:szCs w:val="20"/>
-        </w:rPr>
-        <w:t>;</w:t>
-      </w:r>
-    </w:p>
-    <w:p>
-      <w:pPr>
-        <w:pStyle w:val="PargrafodaLista"/>
-        <w:numPr>
-          <w:ilvl w:val="3"/>
-          <w:numId w:val="2"/>
-        </w:numPr>
-        <w:spacing w:after="0" w:line="360" w:lineRule="auto"/>
-        <w:jc w:val="both"/>
-        <w:rPr>
-          <w:rFonts w:ascii="Arial" w:hAnsi="Arial" w:cs="Arial"/>
-          <w:b/>
-          <w:sz w:val="20"/>
-          <w:szCs w:val="20"/>
-        </w:rPr>
-      </w:pPr>
-      <w:r>
-        <w:rPr>
-          <w:rFonts w:ascii="Arial" w:hAnsi="Arial" w:cs="Arial"/>
-          <w:sz w:val="20"/>
-          <w:szCs w:val="20"/>
-        </w:rPr>
-        <w:t>Monitoramento contínuo da operação e da integridade estrutural</w:t>
-      </w:r>
-      <w:r>
-        <w:rPr>
-          <w:rFonts w:ascii="Arial" w:hAnsi="Arial" w:cs="Arial"/>
-          <w:sz w:val="20"/>
-          <w:szCs w:val="20"/>
-        </w:rPr>
-        <w:t>;</w:t>
-      </w:r>
-    </w:p>
-    <w:p>
-      <w:pPr>
-        <w:pStyle w:val="PargrafodaLista"/>
-        <w:numPr>
-          <w:ilvl w:val="3"/>
-          <w:numId w:val="2"/>
-        </w:numPr>
-        <w:spacing w:after="0" w:line="240" w:lineRule="auto"/>
-        <w:jc w:val="both"/>
-        <w:rPr>
-          <w:rFonts w:ascii="Arial" w:hAnsi="Arial" w:cs="Arial"/>
-          <w:b/>
-          <w:sz w:val="20"/>
-          <w:szCs w:val="20"/>
-        </w:rPr>
-      </w:pPr>
-      <w:r>
-        <w:rPr>
-          <w:rFonts w:ascii="Arial" w:hAnsi="Arial" w:cs="Arial"/>
-          <w:sz w:val="20"/>
-          <w:szCs w:val="20"/>
-        </w:rPr>
-        <w:t>Inspeção visual ou comprovação de desobstrução por teste de vazão</w:t>
-      </w:r>
-      <w:r>
-        <w:rPr>
-          <w:rFonts w:ascii="Arial" w:hAnsi="Arial" w:cs="Arial"/>
-          <w:sz w:val="20"/>
-          <w:szCs w:val="20"/>
-        </w:rPr>
-        <w:t>.</w:t>
-      </w:r>
-    </w:p>
-    <w:p>
-      <w:pPr>
-        <w:autoSpaceDE w:val="0"/>
-        <w:autoSpaceDN w:val="0"/>
-        <w:adjustRightInd w:val="0"/>
-        <w:spacing w:after="0" w:line="240" w:lineRule="auto"/>
-        <w:ind w:firstLine="708"/>
-        <w:jc w:val="both"/>
-        <w:rPr>
-          <w:rFonts w:ascii="Arial" w:hAnsi="Arial" w:cs="Arial"/>
-          <w:sz w:val="20"/>
-          <w:szCs w:val="20"/>
-        </w:rPr>
-      </w:pPr>
-    </w:p>
-    <w:p>
-      <w:pPr>
-        <w:autoSpaceDE w:val="0"/>
-        <w:autoSpaceDN w:val="0"/>
-        <w:adjustRightInd w:val="0"/>
-        <w:spacing w:after="0" w:line="240" w:lineRule="auto"/>
-        <w:ind w:firstLine="708"/>
-        <w:jc w:val="both"/>
-        <w:rPr>
-          <w:rFonts w:ascii="Arial" w:hAnsi="Arial" w:cs="Arial"/>
-          <w:sz w:val="20"/>
-          <w:szCs w:val="20"/>
-        </w:rPr>
-      </w:pPr>
-      <w:r>
-        <w:rPr>
-          <w:rFonts w:ascii="Arial" w:hAnsi="Arial" w:cs="Arial"/>
-          <w:sz w:val="20"/>
-          <w:szCs w:val="20"/>
-        </w:rPr>
-        <w:t>A pressão de trabalho será definida conforme características do material e espessura da tubulação, podendo operar em regime de ultra alta pressão industrial.</w:t>
-      </w:r>
-    </w:p>
-    <w:p>
-      <w:pPr>
-        <w:pStyle w:val="PargrafodaLista"/>
-        <w:spacing w:after="0" w:line="240" w:lineRule="auto"/>
-        <w:ind w:left="2136"/>
-        <w:jc w:val="both"/>
-        <w:rPr>
-          <w:rFonts w:ascii="Arial" w:hAnsi="Arial" w:cs="Arial"/>
-          <w:b/>
-          <w:sz w:val="20"/>
-          <w:szCs w:val="20"/>
-        </w:rPr>
-      </w:pPr>
-    </w:p>
-    <w:p>
-      <w:pPr>
-        <w:pStyle w:val="PargrafodaLista"/>
-        <w:numPr>
-          <w:ilvl w:val="2"/>
-          <w:numId w:val="2"/>
-        </w:numPr>
-        <w:spacing w:after="0" w:line="240" w:lineRule="auto"/>
-        <w:jc w:val="both"/>
-        <w:rPr>
-          <w:rFonts w:ascii="Arial" w:hAnsi="Arial" w:cs="Arial"/>
-          <w:b/>
-          <w:sz w:val="20"/>
-          <w:szCs w:val="20"/>
-        </w:rPr>
-      </w:pPr>
-      <w:r>
-        <w:rPr>
-          <w:rFonts w:ascii="Arial" w:hAnsi="Arial" w:cs="Arial"/>
-          <w:b/>
-          <w:bCs/>
-          <w:sz w:val="20"/>
-          <w:szCs w:val="20"/>
-        </w:rPr>
-        <w:t>Critério de liberação</w:t>
-      </w:r>
-    </w:p>
-    <w:p>
-      <w:pPr>
-        <w:pStyle w:val="PargrafodaLista"/>
-        <w:spacing w:after="0" w:line="240" w:lineRule="auto"/>
-        <w:ind w:left="2136"/>
-        <w:jc w:val="both"/>
-        <w:rPr>
-          <w:rFonts w:ascii="Arial" w:hAnsi="Arial" w:cs="Arial"/>
-          <w:b/>
-          <w:sz w:val="20"/>
-          <w:szCs w:val="20"/>
-        </w:rPr>
-      </w:pPr>
-    </w:p>
-    <w:p>
-      <w:pPr>
-        <w:pStyle w:val="PargrafodaLista"/>
-        <w:numPr>
-          <w:ilvl w:val="3"/>
-          <w:numId w:val="2"/>
-        </w:numPr>
-        <w:spacing w:after="0" w:line="360" w:lineRule="auto"/>
-        <w:jc w:val="both"/>
-        <w:rPr>
-          <w:rFonts w:ascii="Arial" w:hAnsi="Arial" w:cs="Arial"/>
-          <w:b/>
-          <w:sz w:val="20"/>
-          <w:szCs w:val="20"/>
-        </w:rPr>
-      </w:pPr>
-      <w:r>
-        <w:rPr>
-          <w:rFonts w:ascii="Arial" w:hAnsi="Arial" w:cs="Arial"/>
-          <w:sz w:val="20"/>
-          <w:szCs w:val="20"/>
-        </w:rPr>
-        <w:t>Ausência de incrustações aderidas internamente</w:t>
-      </w:r>
-      <w:r>
-        <w:rPr>
-          <w:rFonts w:ascii="Arial" w:hAnsi="Arial" w:cs="Arial"/>
-          <w:sz w:val="20"/>
-          <w:szCs w:val="20"/>
-        </w:rPr>
-        <w:t>;</w:t>
-      </w:r>
-    </w:p>
-    <w:p>
-      <w:pPr>
-        <w:pStyle w:val="PargrafodaLista"/>
-        <w:numPr>
-          <w:ilvl w:val="3"/>
-          <w:numId w:val="2"/>
-        </w:numPr>
-        <w:spacing w:after="0" w:line="360" w:lineRule="auto"/>
-        <w:jc w:val="both"/>
-        <w:rPr>
-          <w:rFonts w:ascii="Arial" w:hAnsi="Arial" w:cs="Arial"/>
-          <w:b/>
-          <w:sz w:val="20"/>
-          <w:szCs w:val="20"/>
-        </w:rPr>
-      </w:pPr>
-      <w:r>
-        <w:rPr>
-          <w:rFonts w:ascii="Arial" w:hAnsi="Arial" w:cs="Arial"/>
-          <w:sz w:val="20"/>
-          <w:szCs w:val="20"/>
-        </w:rPr>
-        <w:t>Restabelecimento da vazão operacional</w:t>
-      </w:r>
-      <w:r>
-        <w:rPr>
-          <w:rFonts w:ascii="Arial" w:hAnsi="Arial" w:cs="Arial"/>
-          <w:sz w:val="20"/>
-          <w:szCs w:val="20"/>
-        </w:rPr>
-        <w:t>;</w:t>
-      </w:r>
-    </w:p>
-    <w:p>
-      <w:pPr>
-        <w:pStyle w:val="PargrafodaLista"/>
-        <w:numPr>
-          <w:ilvl w:val="3"/>
-          <w:numId w:val="2"/>
-        </w:numPr>
-        <w:spacing w:after="0" w:line="360" w:lineRule="auto"/>
-        <w:jc w:val="both"/>
-        <w:rPr>
-          <w:rFonts w:ascii="Arial" w:hAnsi="Arial" w:cs="Arial"/>
-          <w:b/>
-          <w:sz w:val="20"/>
-          <w:szCs w:val="20"/>
-        </w:rPr>
-      </w:pPr>
-      <w:r>
-        <w:rPr>
-          <w:rFonts w:ascii="Arial" w:hAnsi="Arial" w:cs="Arial"/>
-          <w:sz w:val="20"/>
-          <w:szCs w:val="20"/>
-        </w:rPr>
-        <w:t>Linha apta para operação ou ensaios subsequentes</w:t>
-      </w:r>
-      <w:r>
-        <w:rPr>
-          <w:rFonts w:ascii="Arial" w:hAnsi="Arial" w:cs="Arial"/>
-          <w:sz w:val="20"/>
-          <w:szCs w:val="20"/>
-        </w:rPr>
-        <w:t>;</w:t>
-      </w:r>
-    </w:p>
-    <w:p>
-      <w:pPr>
-        <w:pStyle w:val="PargrafodaLista"/>
-        <w:numPr>
-          <w:ilvl w:val="3"/>
-          <w:numId w:val="2"/>
-        </w:numPr>
-        <w:spacing w:after="0" w:line="240" w:lineRule="auto"/>
-        <w:jc w:val="both"/>
-        <w:rPr>
-          <w:rFonts w:ascii="Arial" w:hAnsi="Arial" w:cs="Arial"/>
-          <w:b/>
-          <w:sz w:val="20"/>
-          <w:szCs w:val="20"/>
-        </w:rPr>
-      </w:pPr>
-      <w:r>
-        <w:rPr>
-          <w:rFonts w:ascii="Arial" w:hAnsi="Arial" w:cs="Arial"/>
-          <w:sz w:val="20"/>
-          <w:szCs w:val="20"/>
-        </w:rPr>
-        <w:lastRenderedPageBreak/>
-        <w:t>Validação conjunta com a Contratante</w:t>
-      </w:r>
-      <w:r>
-        <w:rPr>
-          <w:rFonts w:ascii="Arial" w:hAnsi="Arial" w:cs="Arial"/>
-          <w:sz w:val="20"/>
-          <w:szCs w:val="20"/>
-        </w:rPr>
-        <w:t>.</w:t>
-      </w:r>
-    </w:p>
-    <w:p>
-      <w:pPr>
-        <w:spacing w:after="0" w:line="240" w:lineRule="auto"/>
-        <w:jc w:val="both"/>
-        <w:rPr>
-          <w:rFonts w:ascii="Arial" w:hAnsi="Arial" w:cs="Arial"/>
-          <w:b/>
-          <w:sz w:val="20"/>
-          <w:szCs w:val="20"/>
-        </w:rPr>
-      </w:pPr>
-    </w:p>
-    <w:p>
-      <w:pPr>
-        <w:pStyle w:val="PargrafodaLista"/>
-        <w:numPr>
-          <w:ilvl w:val="2"/>
-          <w:numId w:val="2"/>
-        </w:numPr>
-        <w:spacing w:after="0" w:line="240" w:lineRule="auto"/>
-        <w:jc w:val="both"/>
-        <w:rPr>
-          <w:rFonts w:ascii="Arial" w:hAnsi="Arial" w:cs="Arial"/>
-          <w:b/>
-          <w:sz w:val="20"/>
-          <w:szCs w:val="20"/>
-        </w:rPr>
-      </w:pPr>
-      <w:r>
-        <w:rPr>
-          <w:rFonts w:ascii="Arial" w:hAnsi="Arial" w:cs="Arial"/>
-          <w:b/>
-          <w:sz w:val="20"/>
-          <w:szCs w:val="20"/>
-        </w:rPr>
-        <w:t>Passo a passo prévio: </w:t>
-      </w:r>
-    </w:p>
-    <w:p>
-      <w:pPr>
-        <w:spacing w:after="0" w:line="240" w:lineRule="auto"/>
-        <w:jc w:val="both"/>
-        <w:rPr>
-          <w:rFonts w:ascii="Arial" w:hAnsi="Arial" w:cs="Arial"/>
-          <w:b/>
-          <w:sz w:val="20"/>
-          <w:szCs w:val="20"/>
-        </w:rPr>
-      </w:pPr>
-    </w:p>
-    <w:p>
-      <w:pPr>
-        <w:pStyle w:val="PargrafodaLista"/>
-        <w:numPr>
-          <w:ilvl w:val="3"/>
-          <w:numId w:val="2"/>
-        </w:numPr>
-        <w:spacing w:after="0" w:line="240" w:lineRule="auto"/>
-        <w:jc w:val="both"/>
-        <w:rPr>
-          <w:rFonts w:ascii="Arial" w:hAnsi="Arial" w:cs="Arial"/>
-          <w:b/>
-          <w:sz w:val="20"/>
-          <w:szCs w:val="20"/>
-        </w:rPr>
-      </w:pPr>
-      <w:r>
-        <w:rPr>
-          <w:rFonts w:ascii="Arial" w:hAnsi="Arial" w:cs="Arial"/>
-          <w:bCs/>
-          <w:sz w:val="20"/>
-          <w:szCs w:val="20"/>
-        </w:rPr>
-        <w:t>Integração da equipe </w:t>
-      </w:r>
-    </w:p>
-    <w:p>
-      <w:pPr>
-        <w:pStyle w:val="PargrafodaLista"/>
-        <w:numPr>
-          <w:ilvl w:val="3"/>
-          <w:numId w:val="2"/>
-        </w:numPr>
-        <w:spacing w:after="0" w:line="240" w:lineRule="auto"/>
-        <w:jc w:val="both"/>
-        <w:rPr>
-          <w:rFonts w:ascii="Arial" w:hAnsi="Arial" w:cs="Arial"/>
-          <w:b/>
-          <w:sz w:val="20"/>
-          <w:szCs w:val="20"/>
-        </w:rPr>
-      </w:pPr>
-      <w:r>
-        <w:rPr>
-          <w:rFonts w:ascii="Arial" w:hAnsi="Arial" w:cs="Arial"/>
-          <w:bCs/>
-          <w:sz w:val="20"/>
-          <w:szCs w:val="20"/>
-        </w:rPr>
-        <w:t>Preparação e definição do layout do canteiro  </w:t>
-      </w:r>
-    </w:p>
-    <w:p>
-      <w:pPr>
-        <w:pStyle w:val="PargrafodaLista"/>
-        <w:numPr>
-          <w:ilvl w:val="3"/>
-          <w:numId w:val="2"/>
-        </w:numPr>
-        <w:spacing w:after="0" w:line="240" w:lineRule="auto"/>
-        <w:jc w:val="both"/>
-        <w:rPr>
-          <w:rFonts w:ascii="Arial" w:hAnsi="Arial" w:cs="Arial"/>
-          <w:b/>
-          <w:sz w:val="20"/>
-          <w:szCs w:val="20"/>
-        </w:rPr>
-      </w:pPr>
-      <w:r>
-        <w:rPr>
-          <w:rFonts w:ascii="Arial" w:hAnsi="Arial" w:cs="Arial"/>
-          <w:bCs/>
-          <w:sz w:val="20"/>
-          <w:szCs w:val="20"/>
-        </w:rPr>
-        <w:t>Abertura dos documentos e isolamento da área </w:t>
-      </w:r>
-    </w:p>
-    <w:p>
-      <w:pPr>
-        <w:pStyle w:val="PargrafodaLista"/>
-        <w:numPr>
-          <w:ilvl w:val="3"/>
-          <w:numId w:val="2"/>
-        </w:numPr>
-        <w:spacing w:after="0" w:line="240" w:lineRule="auto"/>
-        <w:jc w:val="both"/>
-        <w:rPr>
-          <w:rFonts w:ascii="Arial" w:hAnsi="Arial" w:cs="Arial"/>
-          <w:b/>
-          <w:sz w:val="20"/>
-          <w:szCs w:val="20"/>
-        </w:rPr>
-      </w:pPr>
-      <w:r>
-        <w:rPr>
-          <w:rFonts w:ascii="Arial" w:hAnsi="Arial" w:cs="Arial"/>
-          <w:bCs/>
-          <w:sz w:val="20"/>
-          <w:szCs w:val="20"/>
-        </w:rPr>
-        <w:t>Descarregamento e posicionamento dos equipamentos </w:t>
-      </w:r>
-    </w:p>
-    <w:p>
-      <w:pPr>
-        <w:pStyle w:val="PargrafodaLista"/>
-        <w:numPr>
-          <w:ilvl w:val="3"/>
-          <w:numId w:val="2"/>
-        </w:numPr>
-        <w:spacing w:after="0" w:line="240" w:lineRule="auto"/>
-        <w:jc w:val="both"/>
-        <w:rPr>
-          <w:rFonts w:ascii="Arial" w:hAnsi="Arial" w:cs="Arial"/>
-          <w:b/>
-          <w:sz w:val="20"/>
-          <w:szCs w:val="20"/>
-        </w:rPr>
-      </w:pPr>
-      <w:r>
-        <w:rPr>
-          <w:rFonts w:ascii="Arial" w:hAnsi="Arial" w:cs="Arial"/>
-          <w:bCs/>
-          <w:sz w:val="20"/>
-          <w:szCs w:val="20"/>
-        </w:rPr>
-        <w:t>Instalações e testes </w:t>
-      </w:r>
-    </w:p>
-    <w:p>
-      <w:pPr>
-        <w:pStyle w:val="PargrafodaLista"/>
-        <w:numPr>
-          <w:ilvl w:val="3"/>
-          <w:numId w:val="2"/>
-        </w:numPr>
-        <w:spacing w:after="0" w:line="240" w:lineRule="auto"/>
-        <w:jc w:val="both"/>
-        <w:rPr>
-          <w:rFonts w:ascii="Arial" w:hAnsi="Arial" w:cs="Arial"/>
-          <w:b/>
-          <w:sz w:val="20"/>
-          <w:szCs w:val="20"/>
-        </w:rPr>
-      </w:pPr>
-      <w:r>
-        <w:rPr>
-          <w:rFonts w:ascii="Arial" w:hAnsi="Arial" w:cs="Arial"/>
-          <w:bCs/>
-          <w:sz w:val="20"/>
-          <w:szCs w:val="20"/>
-        </w:rPr>
-        <w:t>Drenagem inicial do óleo BPF (terá que aquecer o óleo para acelerar o processo) </w:t>
-      </w:r>
-    </w:p>
-    <w:p>
-      <w:pPr>
-        <w:pStyle w:val="PargrafodaLista"/>
-        <w:numPr>
-          <w:ilvl w:val="3"/>
-          <w:numId w:val="2"/>
-        </w:numPr>
-        <w:spacing w:after="0" w:line="240" w:lineRule="auto"/>
-        <w:jc w:val="both"/>
-        <w:rPr>
-          <w:rFonts w:ascii="Arial" w:hAnsi="Arial" w:cs="Arial"/>
-          <w:b/>
-          <w:sz w:val="20"/>
-          <w:szCs w:val="20"/>
-        </w:rPr>
-      </w:pPr>
-      <w:r>
-        <w:rPr>
-          <w:rFonts w:ascii="Arial" w:hAnsi="Arial" w:cs="Arial"/>
-          <w:bCs/>
-          <w:sz w:val="20"/>
-          <w:szCs w:val="20"/>
-        </w:rPr>
-        <w:t>Abertura de todos os acessos ao interior do tanque  </w:t>
-      </w:r>
-    </w:p>
-    <w:p>
-      <w:pPr>
-        <w:pStyle w:val="PargrafodaLista"/>
-        <w:numPr>
-          <w:ilvl w:val="3"/>
-          <w:numId w:val="2"/>
-        </w:numPr>
-        <w:spacing w:after="0" w:line="240" w:lineRule="auto"/>
-        <w:jc w:val="both"/>
-        <w:rPr>
-          <w:rFonts w:ascii="Arial" w:hAnsi="Arial" w:cs="Arial"/>
-          <w:b/>
-          <w:sz w:val="20"/>
-          <w:szCs w:val="20"/>
-        </w:rPr>
-      </w:pPr>
-      <w:r>
-        <w:rPr>
-          <w:rFonts w:ascii="Arial" w:hAnsi="Arial" w:cs="Arial"/>
-          <w:bCs/>
-          <w:sz w:val="20"/>
-          <w:szCs w:val="20"/>
-        </w:rPr>
-        <w:t>Medição de gases  </w:t>
-      </w:r>
-    </w:p>
-    <w:p>
-      <w:pPr>
-        <w:pStyle w:val="PargrafodaLista"/>
-        <w:numPr>
-          <w:ilvl w:val="3"/>
-          <w:numId w:val="2"/>
-        </w:numPr>
-        <w:spacing w:after="0" w:line="240" w:lineRule="auto"/>
-        <w:jc w:val="both"/>
-        <w:rPr>
-          <w:rFonts w:ascii="Arial" w:hAnsi="Arial" w:cs="Arial"/>
-          <w:b/>
-          <w:sz w:val="20"/>
-          <w:szCs w:val="20"/>
-        </w:rPr>
-      </w:pPr>
-      <w:r>
-        <w:rPr>
-          <w:rFonts w:ascii="Arial" w:hAnsi="Arial" w:cs="Arial"/>
-          <w:bCs/>
-          <w:sz w:val="20"/>
-          <w:szCs w:val="20"/>
-        </w:rPr>
-        <w:t>Aplicação de ventilação forçada  </w:t>
-      </w:r>
-    </w:p>
-    <w:p>
-      <w:pPr>
-        <w:pStyle w:val="PargrafodaLista"/>
-        <w:numPr>
-          <w:ilvl w:val="3"/>
-          <w:numId w:val="2"/>
-        </w:numPr>
-        <w:spacing w:after="0" w:line="240" w:lineRule="auto"/>
-        <w:jc w:val="both"/>
-        <w:rPr>
-          <w:rFonts w:ascii="Arial" w:hAnsi="Arial" w:cs="Arial"/>
-          <w:b/>
-          <w:sz w:val="20"/>
-          <w:szCs w:val="20"/>
-        </w:rPr>
-      </w:pPr>
-      <w:r>
-        <w:rPr>
-          <w:rFonts w:ascii="Arial" w:hAnsi="Arial" w:cs="Arial"/>
-          <w:bCs/>
-          <w:sz w:val="20"/>
-          <w:szCs w:val="20"/>
-        </w:rPr>
-        <w:t>Medição de gases </w:t>
-      </w:r>
-    </w:p>
-    <w:p>
-      <w:pPr>
-        <w:pStyle w:val="PargrafodaLista"/>
-        <w:numPr>
-          <w:ilvl w:val="3"/>
-          <w:numId w:val="2"/>
-        </w:numPr>
-        <w:spacing w:after="0" w:line="240" w:lineRule="auto"/>
-        <w:jc w:val="both"/>
-        <w:rPr>
-          <w:rFonts w:ascii="Arial" w:hAnsi="Arial" w:cs="Arial"/>
-          <w:b/>
-          <w:sz w:val="20"/>
-          <w:szCs w:val="20"/>
-        </w:rPr>
-      </w:pPr>
-      <w:r>
-        <w:rPr>
-          <w:rFonts w:ascii="Arial" w:hAnsi="Arial" w:cs="Arial"/>
-          <w:bCs/>
-          <w:sz w:val="20"/>
-          <w:szCs w:val="20"/>
-        </w:rPr>
-        <w:t>Abertura de documentação e preparação para acesso de espaço confinado </w:t>
-      </w:r>
-    </w:p>
-    <w:p>
-      <w:pPr>
-        <w:pStyle w:val="PargrafodaLista"/>
-        <w:numPr>
-          <w:ilvl w:val="3"/>
-          <w:numId w:val="2"/>
-        </w:numPr>
-        <w:spacing w:after="0" w:line="240" w:lineRule="auto"/>
-        <w:jc w:val="both"/>
-        <w:rPr>
-          <w:rFonts w:ascii="Arial" w:hAnsi="Arial" w:cs="Arial"/>
-          <w:b/>
-          <w:sz w:val="20"/>
-          <w:szCs w:val="20"/>
-        </w:rPr>
-      </w:pPr>
-      <w:r>
-        <w:rPr>
-          <w:rFonts w:ascii="Arial" w:hAnsi="Arial" w:cs="Arial"/>
-          <w:bCs/>
-          <w:sz w:val="20"/>
-          <w:szCs w:val="20"/>
-        </w:rPr>
-        <w:t>Limpeza manual  </w:t>
-      </w:r>
-    </w:p>
-    <w:p>
-      <w:pPr>
-        <w:pStyle w:val="PargrafodaLista"/>
-        <w:numPr>
-          <w:ilvl w:val="3"/>
-          <w:numId w:val="2"/>
-        </w:numPr>
-        <w:spacing w:after="0" w:line="240" w:lineRule="auto"/>
-        <w:jc w:val="both"/>
-        <w:rPr>
-          <w:rFonts w:ascii="Arial" w:hAnsi="Arial" w:cs="Arial"/>
-          <w:b/>
-          <w:sz w:val="20"/>
-          <w:szCs w:val="20"/>
-        </w:rPr>
-      </w:pPr>
-      <w:r>
-        <w:rPr>
-          <w:rFonts w:ascii="Arial" w:hAnsi="Arial" w:cs="Arial"/>
-          <w:bCs/>
-          <w:sz w:val="20"/>
-          <w:szCs w:val="20"/>
-        </w:rPr>
-        <w:t>Lavagem  </w:t>
-      </w:r>
-    </w:p>
-    <w:p>
-      <w:pPr>
-        <w:spacing w:after="0" w:line="240" w:lineRule="auto"/>
-        <w:jc w:val="both"/>
-        <w:rPr>
-          <w:rFonts w:ascii="Arial" w:hAnsi="Arial" w:cs="Arial"/>
-          <w:b/>
-          <w:sz w:val="20"/>
-          <w:szCs w:val="20"/>
-        </w:rPr>
-      </w:pPr>
-    </w:p>
-    <w:p>
-      <w:pPr>
-        <w:pStyle w:val="PargrafodaLista"/>
-        <w:numPr>
-          <w:ilvl w:val="2"/>
-          <w:numId w:val="2"/>
-        </w:numPr>
-        <w:spacing w:after="0" w:line="240" w:lineRule="auto"/>
-        <w:jc w:val="both"/>
-        <w:rPr>
-          <w:rFonts w:ascii="Arial" w:hAnsi="Arial" w:cs="Arial"/>
-          <w:b/>
-          <w:sz w:val="20"/>
-          <w:szCs w:val="20"/>
-        </w:rPr>
-      </w:pPr>
-      <w:r>
-        <w:rPr>
-          <w:rFonts w:ascii="Arial" w:hAnsi="Arial" w:cs="Arial"/>
-          <w:b/>
-          <w:sz w:val="20"/>
-          <w:szCs w:val="20"/>
-        </w:rPr>
-        <w:t>Critério de aceitação  </w:t>
-      </w:r>
-    </w:p>
-    <w:p>
-      <w:pPr>
-        <w:pStyle w:val="PargrafodaLista"/>
-        <w:spacing w:after="0" w:line="240" w:lineRule="auto"/>
-        <w:ind w:left="2136"/>
-        <w:jc w:val="both"/>
-        <w:rPr>
-          <w:rFonts w:ascii="Arial" w:hAnsi="Arial" w:cs="Arial"/>
-          <w:b/>
-          <w:sz w:val="20"/>
-          <w:szCs w:val="20"/>
-        </w:rPr>
-      </w:pPr>
-    </w:p>
-    <w:p>
-      <w:pPr>
-        <w:pStyle w:val="PargrafodaLista"/>
-        <w:numPr>
-          <w:ilvl w:val="3"/>
-          <w:numId w:val="2"/>
-        </w:numPr>
-        <w:spacing w:after="0" w:line="240" w:lineRule="auto"/>
-        <w:jc w:val="both"/>
-        <w:rPr>
-          <w:rFonts w:ascii="Arial" w:hAnsi="Arial" w:cs="Arial"/>
-          <w:b/>
-          <w:sz w:val="20"/>
-          <w:szCs w:val="20"/>
-        </w:rPr>
-      </w:pPr>
-      <w:r>
-        <w:rPr>
-          <w:rFonts w:ascii="Arial" w:hAnsi="Arial" w:cs="Arial"/>
-          <w:bCs/>
-          <w:sz w:val="20"/>
-          <w:szCs w:val="20"/>
-        </w:rPr>
-        <w:t>Interior do tanque (Fundo, costado e teto) isento de óleo. </w:t>
-      </w:r>
-    </w:p>
-    <w:p>
-      <w:pPr>
-        <w:autoSpaceDE w:val="0"/>
-        <w:autoSpaceDN w:val="0"/>
-        <w:adjustRightInd w:val="0"/>
-        <w:spacing w:after="0" w:line="240" w:lineRule="auto"/>
-        <w:jc w:val="both"/>
-        <w:rPr>
-          <w:rFonts w:ascii="Arial" w:hAnsi="Arial" w:cs="Arial"/>
-          <w:b/>
-          <w:sz w:val="20"/>
-          <w:szCs w:val="20"/>
-        </w:rPr>
-      </w:pPr>
-    </w:p>
-    <w:p>
-      <w:pPr>
-        <w:autoSpaceDE w:val="0"/>
-        <w:autoSpaceDN w:val="0"/>
-        <w:adjustRightInd w:val="0"/>
-        <w:spacing w:after="0" w:line="240" w:lineRule="auto"/>
-        <w:jc w:val="both"/>
-        <w:rPr>
-          <w:rFonts w:ascii="Arial" w:hAnsi="Arial" w:cs="Arial"/>
-          <w:b/>
-          <w:sz w:val="20"/>
-          <w:szCs w:val="20"/>
-        </w:rPr>
-      </w:pPr>
     </w:p>
     <w:p>
       <w:pPr>

</xml_diff>